<commit_message>
HP Textbausteine: kürzer, kein Studienkram, Probiotika-Hinweis gestärkt
</commit_message>
<xml_diff>
--- a/HP_Arztbrief_Textbausteine.docx
+++ b/HP_Arztbrief_Textbausteine.docx
@@ -47,21 +47,21 @@
           <w:sz w:val="28"/>
           <w:szCs w:val="28"/>
         </w:rPr>
-        <w:t xml:space="preserve">Baustein 1 – Erstgradigverwandte bei Magenkarzinom in der Familie</w:t>
-      </w:r>
-    </w:p>
-    <w:p>
-      <w:pPr>
-        <w:spacing w:after="80" w:before="60"/>
-        <w:jc w:val="both"/>
-      </w:pPr>
-      <w:r>
-        <w:rPr>
-          <w:rFonts w:ascii="Calibri" w:cs="Calibri" w:eastAsia="Calibri" w:hAnsi="Calibri"/>
-          <w:sz w:val="22"/>
-          <w:szCs w:val="22"/>
-        </w:rPr>
-        <w:t xml:space="preserve">Bei bekannter familiärer Belastung durch ein Magenkarzinom (Erstgradigverwandte/r betroffen) empfehlen wir leitliniengerecht ein H.-pylori-Screening. Ein positiver Nachweis sollte konsequent eradiziert werden (Test-and-Treat-Strategie, Maastricht VI 2022). Wir bitten, Herrn/Frau [Name] zur weiteren Diagnostik einzubestellen: bevorzugt mittels ¹³C-Harnstoff-Atemtest (Mittel der Wahl) oder H.-pylori-Stuhl-Antigen. Cave: Abstand zu PPI ≥ 2 Wochen, Abstand zu Antibiotika ≥ 4 Wochen vor dem Test. Bei Nachweis einer Infektion: Eradikationstherapie nach aktuellem Schema, Eradikationskontrolle mittels ¹³C-Atemtest frühestens 4 Wochen nach Therapieende.</w:t>
+        <w:t xml:space="preserve">Baustein 1 – Screening Erstgradigverwandte bei Magenkarzinom</w:t>
+      </w:r>
+    </w:p>
+    <w:p>
+      <w:pPr>
+        <w:spacing w:after="100" w:before="60"/>
+        <w:jc w:val="both"/>
+      </w:pPr>
+      <w:r>
+        <w:rPr>
+          <w:rFonts w:ascii="Calibri" w:cs="Calibri" w:eastAsia="Calibri" w:hAnsi="Calibri"/>
+          <w:sz w:val="22"/>
+          <w:szCs w:val="22"/>
+        </w:rPr>
+        <w:t xml:space="preserve">Bei nachgewiesenem Magenkarzinom eines Erstgradigverwandten empfehlen wir entsprechend der aktuellen Leitlinien ein Screening auf Helicobacter pylori. Bei positivem Nachweis sollte eine Eradikation eingeleitet werden. Bitte Herrn/Frau [Name] zur Testung einbestellen – bevorzugt mittels ¹³C-Harnstoff-Atemtest oder H.-pylori-Stuhl-Antigen.</w:t>
       </w:r>
     </w:p>
     <w:p>
@@ -95,16 +95,44 @@
     </w:p>
     <w:p>
       <w:pPr>
-        <w:spacing w:after="80" w:before="60"/>
-        <w:jc w:val="both"/>
-      </w:pPr>
-      <w:r>
-        <w:rPr>
-          <w:rFonts w:ascii="Calibri" w:cs="Calibri" w:eastAsia="Calibri" w:hAnsi="Calibri"/>
-          <w:sz w:val="22"/>
-          <w:szCs w:val="22"/>
-        </w:rPr>
-        <w:t xml:space="preserve">Befund: Helicobacter-pylori-Infektion gesichert (Nachweis via [¹³C-Atemtest / Stuhl-Antigen / Histologie]). Wir empfehlen eine Eradikationstherapie entsprechend der lokalen Resistenzlage. Bevorzugtes Schema bei Clarithromycin-Resistenz &lt; 15 %: PPI (2×/d) + Clarithromycin 500 mg (2×/d) + Amoxicillin 1 g (2×/d) über 14 Tage. Bei Penicillinallergie oder Resistenzrate ≥ 15 %: Bismuth-Quadruple-Therapie (Pylera®) × 10 Tage oder Levofloxacin-Triple × 14 Tage nach Resistenztestung. Eradikationskontrolle: ¹³C-Atemtest frühestens 4 Wochen nach Therapieende, PPI-Pause ≥ 2 Wochen vor Kontrolltest. Aktuelle Clarithromycin-Resistenzrate in Deutschland: regional 15–25 % (RKI 2022); bei Therapieversagen Resistenztestung via Kultur oder molekularer PCR empfohlen.</w:t>
+        <w:spacing w:after="100" w:before="60"/>
+        <w:jc w:val="both"/>
+      </w:pPr>
+      <w:r>
+        <w:rPr>
+          <w:rFonts w:ascii="Calibri" w:cs="Calibri" w:eastAsia="Calibri" w:hAnsi="Calibri"/>
+          <w:sz w:val="22"/>
+          <w:szCs w:val="22"/>
+        </w:rPr>
+        <w:t xml:space="preserve">Befund: Helicobacter-pylori-Infektion gesichert (Nachweis via [¹³C-Atemtest / Stuhl-Antigen / Histologie]).</w:t>
+      </w:r>
+    </w:p>
+    <w:p>
+      <w:pPr>
+        <w:spacing w:after="100" w:before="60"/>
+        <w:jc w:val="both"/>
+      </w:pPr>
+      <w:r>
+        <w:rPr>
+          <w:rFonts w:ascii="Calibri" w:cs="Calibri" w:eastAsia="Calibri" w:hAnsi="Calibri"/>
+          <w:sz w:val="22"/>
+          <w:szCs w:val="22"/>
+        </w:rPr>
+        <w:t xml:space="preserve">Empfehlung: Wir empfehlen eine Eradikationstherapie, vorzugsweise als Bismuth-Quadruple-Therapie (Pylera® × 10 Tage), alternativ Clarithromycin-Triple (PPI + Clarithromycin 500 mg + Amoxicillin 1 g, je 2×/d × 14 Tage).</w:t>
+      </w:r>
+    </w:p>
+    <w:p>
+      <w:pPr>
+        <w:spacing w:after="100" w:before="60"/>
+        <w:jc w:val="both"/>
+      </w:pPr>
+      <w:r>
+        <w:rPr>
+          <w:rFonts w:ascii="Calibri" w:cs="Calibri" w:eastAsia="Calibri" w:hAnsi="Calibri"/>
+          <w:sz w:val="22"/>
+          <w:szCs w:val="22"/>
+        </w:rPr>
+        <w:t xml:space="preserve">Eradikationskontrolle: ¹³C-Harnstoff-Atemtest frühestens 4 Wochen nach Therapieende; PPI-Pause mindestens 2 Wochen vor dem Test.</w:t>
       </w:r>
     </w:p>
     <w:p>
@@ -133,21 +161,21 @@
           <w:sz w:val="28"/>
           <w:szCs w:val="28"/>
         </w:rPr>
-        <w:t xml:space="preserve">Baustein 3 – Haushaltsmitglieder ohne familiäre Magenkarzinom-Last</w:t>
-      </w:r>
-    </w:p>
-    <w:p>
-      <w:pPr>
-        <w:spacing w:after="80" w:before="60"/>
-        <w:jc w:val="both"/>
-      </w:pPr>
-      <w:r>
-        <w:rPr>
-          <w:rFonts w:ascii="Calibri" w:cs="Calibri" w:eastAsia="Calibri" w:hAnsi="Calibri"/>
-          <w:sz w:val="22"/>
-          <w:szCs w:val="22"/>
-        </w:rPr>
-        <w:t xml:space="preserve">Wir weisen darauf hin, dass H. pylori intrafamiliär übertragen werden kann. Ein routinemäßiges Screening asymptomatischer Haushaltsmitglieder ist nach aktueller Leitlinie (Maastricht VI 2022) in Deutschland nicht generell empfohlen. Eine Testung empfehlen wir bei Dyspepsie-Symptomatik (Epigastralgien, postprandiales Völlegefühl), Herkunft aus einem Hochprävalenzland (&gt; 50 %, z. B. Türkei, Osteuropa, Asien), zusätzlichen Risikofaktoren (z. B. NSAID-Dauertherapie, geplante Immunsuppression) oder auf ausdrücklichen Patientenwunsch nach eingehender Aufklärung.</w:t>
+        <w:t xml:space="preserve">Baustein 3 – Haushaltsmitglieder</w:t>
+      </w:r>
+    </w:p>
+    <w:p>
+      <w:pPr>
+        <w:spacing w:after="100" w:before="60"/>
+        <w:jc w:val="both"/>
+      </w:pPr>
+      <w:r>
+        <w:rPr>
+          <w:rFonts w:ascii="Calibri" w:cs="Calibri" w:eastAsia="Calibri" w:hAnsi="Calibri"/>
+          <w:sz w:val="22"/>
+          <w:szCs w:val="22"/>
+        </w:rPr>
+        <w:t xml:space="preserve">Wir weisen darauf hin, dass H. pylori intrafamiliär übertragen werden kann. Ein routinemäßiges Screening asymptomatischer Haushaltsmitglieder ist leitliniengemäß nicht generell empfohlen. Eine Testung empfehlen wir bei Dyspepsie-Symptomatik, Herkunft aus einem Hochprävalenzland oder auf ausdrücklichen Patientenwunsch.</w:t>
       </w:r>
     </w:p>
     <w:p>
@@ -181,16 +209,16 @@
     </w:p>
     <w:p>
       <w:pPr>
-        <w:spacing w:after="80" w:before="60"/>
-        <w:jc w:val="both"/>
-      </w:pPr>
-      <w:r>
-        <w:rPr>
-          <w:rFonts w:ascii="Calibri" w:cs="Calibri" w:eastAsia="Calibri" w:hAnsi="Calibri"/>
-          <w:sz w:val="22"/>
-          <w:szCs w:val="22"/>
-        </w:rPr>
-        <w:t xml:space="preserve">Wir bitten um Eradikationskontrolle mittels ¹³C-Harnstoff-Atemtest frühestens 4 Wochen nach Therapieende. PPI-Pause mindestens 2 Wochen, Antibiotika-Pause mindestens 4 Wochen vor dem Test (falsch-negative Ergebnisse möglich). Bei erneutem Nachweis (Therapieversagen): Resistenztestung empfohlen (Kultur aus Biopsie oder molekulare PCR), Rescue-Therapie nach Resistogramm (z. B. Bismuth-Quadruple oder Levofloxacin-basiert). Bei negativem Kontrolltest: Abschluss der Behandlung, keine weitere Kontrolle erforderlich, sofern kein Ulkus, kein MALT-Lymphom und keine Magenkarzinom-Familienanamnese vorliegen.</w:t>
+        <w:spacing w:after="100" w:before="60"/>
+        <w:jc w:val="both"/>
+      </w:pPr>
+      <w:r>
+        <w:rPr>
+          <w:rFonts w:ascii="Calibri" w:cs="Calibri" w:eastAsia="Calibri" w:hAnsi="Calibri"/>
+          <w:sz w:val="22"/>
+          <w:szCs w:val="22"/>
+        </w:rPr>
+        <w:t xml:space="preserve">Wir bitten um Eradikationskontrolle mittels ¹³C-Harnstoff-Atemtest frühestens 4 Wochen nach Therapieende (PPI-Pause ≥ 2 Wochen, Antibiotika-Pause ≥ 4 Wochen vor dem Test). Bei Therapieversagen empfehlen wir eine Resistenztestung vor Einleitung einer Rescue-Therapie.</w:t>
       </w:r>
     </w:p>
     <w:p>
@@ -224,16 +252,30 @@
     </w:p>
     <w:p>
       <w:pPr>
-        <w:spacing w:after="80" w:before="60"/>
-        <w:jc w:val="both"/>
-      </w:pPr>
-      <w:r>
-        <w:rPr>
-          <w:rFonts w:ascii="Calibri" w:cs="Calibri" w:eastAsia="Calibri" w:hAnsi="Calibri"/>
-          <w:sz w:val="22"/>
-          <w:szCs w:val="22"/>
-        </w:rPr>
-        <w:t xml:space="preserve">Begleitend zur Eradikationstherapie kann der Einsatz von Probiotika erwogen werden. Aktuelle Metaanalysen (u. a. Nature Scientific Reports 2024, 534 RCTs; europäische Netzwerk-Metaanalyse 2025) zeigen eine signifikante Reduktion therapiebedingter Nebenwirkungen wie Diarrhö, Übelkeit, Erbrechen und Geschmacksstörungen um ca. 50 % sowie eine moderate Verbesserung der Eradikationsrate. Besonders gut untersucht sind Bifidobacterium longum (OR 2,52 für erfolgreiche Eradikation vs. Kontrolle), Lactobacillus-Spezies sowie Saccharomyces boulardii (insbesondere zur Nebenwirkungsreduktion). Eine Vorbehandlung über mindestens 14 Tage vor Beginn der Antibiotikatherapie scheint den Effekt zu optimieren. Die Gabe sollte für die Dauer der Eradikationstherapie und ggf. darüber hinaus fortgeführt werden.</w:t>
+        <w:spacing w:after="100" w:before="60"/>
+        <w:jc w:val="both"/>
+      </w:pPr>
+      <w:r>
+        <w:rPr>
+          <w:rFonts w:ascii="Calibri" w:cs="Calibri" w:eastAsia="Calibri" w:hAnsi="Calibri"/>
+          <w:sz w:val="22"/>
+          <w:szCs w:val="22"/>
+        </w:rPr>
+        <w:t xml:space="preserve">Begleitend zur Eradikationstherapie empfehlen wir den Einsatz von Probiotika – insbesondere bei Risikopatienten, z. B. nach vorherigem Therapieabbruch, bekannter Unverträglichkeit oder Rezidiv.</w:t>
+      </w:r>
+    </w:p>
+    <w:p>
+      <w:pPr>
+        <w:spacing w:after="100" w:before="60"/>
+        <w:jc w:val="both"/>
+      </w:pPr>
+      <w:r>
+        <w:rPr>
+          <w:rFonts w:ascii="Calibri" w:cs="Calibri" w:eastAsia="Calibri" w:hAnsi="Calibri"/>
+          <w:sz w:val="22"/>
+          <w:szCs w:val="22"/>
+        </w:rPr>
+        <w:t xml:space="preserve">Probiotika können die Eradikationsrate verbessern und gastrointestinale Nebenwirkungen der Antibiotikatherapie (Diarrhö, Übelkeit, Erbrechen) deutlich reduzieren. Gut geeignet sind Präparate auf Basis von Bifidobacterium longum, Lactobacillus-Spezies oder Saccharomyces boulardii. Einnahme für die Dauer der Therapie, idealerweise bereits einige Tage vorher beginnen.</w:t>
       </w:r>
     </w:p>
     <w:p>
@@ -249,55 +291,12 @@
           <w:sz w:val="19"/>
           <w:szCs w:val="19"/>
         </w:rPr>
-        <w:t xml:space="preserve">Hinweis: Die Evidenzlage ist insgesamt positiv, ein allgemeiner Leitlinienstandard besteht noch nicht. Der Einsatz ist individuell vertretbar und kann bei erhöhtem Nebenwirkungsrisiko (z. B. vorbekannte Diarrhöneigung, ältere Patient:innen) besonders sinnvoll sein.</w:t>
-      </w:r>
-    </w:p>
-    <w:p>
-      <w:pPr>
-        <w:spacing w:after="200" w:before="200"/>
-      </w:pPr>
-      <w:r>
-        <w:rPr>
-          <w:color w:val="c8dede"/>
-          <w:sz w:val="18"/>
-          <w:szCs w:val="18"/>
-        </w:rPr>
-        <w:t xml:space="preserve">─────────────────────────────────────────</w:t>
-      </w:r>
-    </w:p>
-    <w:p>
-      <w:pPr>
-        <w:spacing w:after="120" w:before="360"/>
-      </w:pPr>
-      <w:r>
-        <w:rPr>
-          <w:rFonts w:ascii="Calibri" w:cs="Calibri" w:eastAsia="Calibri" w:hAnsi="Calibri"/>
-          <w:b/>
-          <w:bCs/>
-          <w:color w:val="0C4E54"/>
-          <w:sz w:val="28"/>
-          <w:szCs w:val="28"/>
-        </w:rPr>
-        <w:t xml:space="preserve">Testverfahren im Überblick</w:t>
-      </w:r>
-    </w:p>
-    <w:p>
-      <w:pPr>
-        <w:spacing w:after="80" w:before="60"/>
-        <w:jc w:val="both"/>
-      </w:pPr>
-      <w:r>
-        <w:rPr>
-          <w:rFonts w:ascii="Calibri" w:cs="Calibri" w:eastAsia="Calibri" w:hAnsi="Calibri"/>
-          <w:sz w:val="22"/>
-          <w:szCs w:val="22"/>
-        </w:rPr>
-        <w:t xml:space="preserve">¹³C-Harnstoff-Atemtest: Sensitivität &gt; 95 %, Spezifität &gt; 95 % – Goldstandard, nicht-invasiv; PPI-Pause 2 Wochen erforderlich. Stuhl-Antigen: Sensitivität &gt; 94 %, Spezifität &gt; 97 % – gut für Kinder geeignet, PPI-Pause 2 Wochen erforderlich. Serologie (IgG): ca. 85 % / 79 % – nicht für Eradikationskontrolle geeignet. Histologie/Biopsie: &gt; 95 % / &gt; 95 % – invasiv, Goldstandard bei gleichzeitiger Gastroskopie. Schnell-Urease-Test: 90–95 % / &gt; 95 % – intraoperativ, PPI- und AB-Pause beachten.</w:t>
-      </w:r>
-    </w:p>
-    <w:p>
-      <w:pPr>
-        <w:spacing w:before="400"/>
+        <w:t xml:space="preserve">Cave: Probiotika nicht zeitgleich mit dem Antibiotikum einnehmen – mindestens 2 Stunden Abstand einhalten.</w:t>
+      </w:r>
+    </w:p>
+    <w:p>
+      <w:pPr>
+        <w:spacing w:before="480"/>
       </w:pPr>
       <w:r>
         <w:rPr>

</xml_diff>

<commit_message>
Baustein 1: Formulierung angepasst; Baustein 2: nur Bismuth-Quadruple
</commit_message>
<xml_diff>
--- a/HP_Arztbrief_Textbausteine.docx
+++ b/HP_Arztbrief_Textbausteine.docx
@@ -61,7 +61,7 @@
           <w:sz w:val="22"/>
           <w:szCs w:val="22"/>
         </w:rPr>
-        <w:t xml:space="preserve">Bei nachgewiesenem Magenkarzinom eines Erstgradigverwandten empfehlen wir entsprechend der aktuellen Leitlinien ein Screening auf Helicobacter pylori. Bei positivem Nachweis sollte eine Eradikation eingeleitet werden. Bitte Herrn/Frau [Name] zur Testung einbestellen – bevorzugt mittels ¹³C-Harnstoff-Atemtest oder H.-pylori-Stuhl-Antigen.</w:t>
+        <w:t>Bei nachgewiesenem Magenkarzinom empfehlen wir entsprechend der aktuellen Leitlinien ein Screening erstgradig Verwandter auf Helicobacter pylori. Bei positivem Nachweis sollte eine Eradikation eingeleitet werden.</w:t>
       </w:r>
     </w:p>
     <w:p>
@@ -118,7 +118,7 @@
           <w:sz w:val="22"/>
           <w:szCs w:val="22"/>
         </w:rPr>
-        <w:t xml:space="preserve">Empfehlung: Wir empfehlen eine Eradikationstherapie, vorzugsweise als Bismuth-Quadruple-Therapie (Pylera® × 10 Tage), alternativ Clarithromycin-Triple (PPI + Clarithromycin 500 mg + Amoxicillin 1 g, je 2×/d × 14 Tage).</w:t>
+        <w:t>Empfehlung: Wir empfehlen eine Eradikationstherapie als Bismuth-Quadruple-Therapie (Pylera® × 10 Tage).</w:t>
       </w:r>
     </w:p>
     <w:p>

</xml_diff>

<commit_message>
Baustein 3: Familienanamnese und Test-and-Treat Magenkrebs-Prävention ergänzt
</commit_message>
<xml_diff>
--- a/HP_Arztbrief_Textbausteine.docx
+++ b/HP_Arztbrief_Textbausteine.docx
@@ -175,7 +175,10 @@
           <w:sz w:val="22"/>
           <w:szCs w:val="22"/>
         </w:rPr>
-        <w:t xml:space="preserve">Wir weisen darauf hin, dass H. pylori intrafamiliär übertragen werden kann. Ein routinemäßiges Screening asymptomatischer Haushaltsmitglieder ist leitliniengemäß nicht generell empfohlen. Eine Testung empfehlen wir bei Dyspepsie-Symptomatik, Herkunft aus einem Hochprävalenzland oder auf ausdrücklichen Patientenwunsch.</w:t>
+        <w:t>Wir weisen darauf hin, dass H. pylori intrafamiliär übertragen werden kann. Ein routinemäßiges Screening asymptomatischer Haushaltsmitglieder ist leitliniengemäß nicht generell empfohlen. Eine Testung empfehlen wir bei Dyspepsie-Symptomatik, Herkunft aus einem Hochprävalenzland oder auf ausdrücklichen Patientenwunsch.</w:t>
+        <w:br/>
+        <w:br/>
+        <w:t>Im Rahmen der Magenkrebs-Prävention empfehlen wir darüber hinaus eine gezielte Familienanamnese hinsichtlich gastraler Malignome. Bei entsprechender Familienanamnese (Magenkarzinom bei Erstgradigverwandten) befürworten wir ein Test-and-Treat-Vorgehen für H. pylori — auch bei asymptomatischen Angehörigen — als niedrigschwellige und evidenzbasierte Präventionsmaßnahme.</w:t>
       </w:r>
     </w:p>
     <w:p>

</xml_diff>

<commit_message>
Baustein 4 in Baustein 2 integriert; ehemaliger Baustein 5 zu Baustein 4 umbenannt
</commit_message>
<xml_diff>
--- a/HP_Arztbrief_Textbausteine.docx
+++ b/HP_Arztbrief_Textbausteine.docx
@@ -207,50 +207,7 @@
           <w:sz w:val="28"/>
           <w:szCs w:val="28"/>
         </w:rPr>
-        <w:t xml:space="preserve">Baustein 4 – Eradikationskontrolle nach Therapie</w:t>
-      </w:r>
-    </w:p>
-    <w:p>
-      <w:pPr>
-        <w:spacing w:after="100" w:before="60"/>
-        <w:jc w:val="both"/>
-      </w:pPr>
-      <w:r>
-        <w:rPr>
-          <w:rFonts w:ascii="Calibri" w:cs="Calibri" w:eastAsia="Calibri" w:hAnsi="Calibri"/>
-          <w:sz w:val="22"/>
-          <w:szCs w:val="22"/>
-        </w:rPr>
-        <w:t xml:space="preserve">Wir bitten um Eradikationskontrolle mittels ¹³C-Harnstoff-Atemtest frühestens 4 Wochen nach Therapieende (PPI-Pause ≥ 2 Wochen, Antibiotika-Pause ≥ 4 Wochen vor dem Test). Bei Therapieversagen empfehlen wir eine Resistenztestung vor Einleitung einer Rescue-Therapie.</w:t>
-      </w:r>
-    </w:p>
-    <w:p>
-      <w:pPr>
-        <w:spacing w:after="200" w:before="200"/>
-      </w:pPr>
-      <w:r>
-        <w:rPr>
-          <w:color w:val="c8dede"/>
-          <w:sz w:val="18"/>
-          <w:szCs w:val="18"/>
-        </w:rPr>
-        <w:t xml:space="preserve">─────────────────────────────────────────</w:t>
-      </w:r>
-    </w:p>
-    <w:p>
-      <w:pPr>
-        <w:spacing w:after="120" w:before="360"/>
-      </w:pPr>
-      <w:r>
-        <w:rPr>
-          <w:rFonts w:ascii="Calibri" w:cs="Calibri" w:eastAsia="Calibri" w:hAnsi="Calibri"/>
-          <w:b/>
-          <w:bCs/>
-          <w:color w:val="0C4E54"/>
-          <w:sz w:val="28"/>
-          <w:szCs w:val="28"/>
-        </w:rPr>
-        <w:t xml:space="preserve">Baustein 5 – Probiotika begleitend zur Eradikationstherapie</w:t>
+        <w:t>Baustein 4 – Probiotika begleitend zur Eradikationstherapie</w:t>
       </w:r>
     </w:p>
     <w:p>

</xml_diff>

<commit_message>
Reihenfolge: Probiotika zu B3, Haushaltsmitglieder zu B4
</commit_message>
<xml_diff>
--- a/HP_Arztbrief_Textbausteine.docx
+++ b/HP_Arztbrief_Textbausteine.docx
@@ -161,7 +161,7 @@
           <w:sz w:val="28"/>
           <w:szCs w:val="28"/>
         </w:rPr>
-        <w:t xml:space="preserve">Baustein 3 – Haushaltsmitglieder</w:t>
+        <w:t>Baustein 3 – Probiotika begleitend zur Eradikationstherapie</w:t>
       </w:r>
     </w:p>
     <w:p>
@@ -175,10 +175,7 @@
           <w:sz w:val="22"/>
           <w:szCs w:val="22"/>
         </w:rPr>
-        <w:t>Wir weisen darauf hin, dass H. pylori intrafamiliär übertragen werden kann. Ein routinemäßiges Screening asymptomatischer Haushaltsmitglieder ist leitliniengemäß nicht generell empfohlen. Eine Testung empfehlen wir bei Dyspepsie-Symptomatik, Herkunft aus einem Hochprävalenzland oder auf ausdrücklichen Patientenwunsch.</w:t>
-        <w:br/>
-        <w:br/>
-        <w:t>Im Rahmen der Magenkrebs-Prävention empfehlen wir darüber hinaus eine gezielte Familienanamnese hinsichtlich gastraler Malignome. Bei entsprechender Familienanamnese (Magenkarzinom bei Erstgradigverwandten) befürworten wir ein Test-and-Treat-Vorgehen für H. pylori — auch bei asymptomatischen Angehörigen — als niedrigschwellige und evidenzbasierte Präventionsmaßnahme.</w:t>
+        <w:t>Begleitend zur Eradikationstherapie empfehlen wir den Einsatz von Probiotika – insbesondere bei Risikopatienten, z. B. nach vorherigem Therapieabbruch, bekannter Unverträglichkeit oder Rezidiv.</w:t>
       </w:r>
     </w:p>
     <w:p>
@@ -191,7 +188,7 @@
           <w:sz w:val="18"/>
           <w:szCs w:val="18"/>
         </w:rPr>
-        <w:t xml:space="preserve">─────────────────────────────────────────</w:t>
+        <w:t>Probiotika können die Eradikationsrate verbessern und gastrointestinale Nebenwirkungen der Antibiotikatherapie (Diarrhö, Übelkeit, Erbrechen) deutlich reduzieren. Gut geeignet sind Präparate auf Basis von Bifidobacterium longum, Lactobacillus-Spezies oder Saccharomyces boulardii. Einnahme für die Dauer der Therapie, idealerweise bereits einige Tage vorher beginnen.</w:t>
       </w:r>
     </w:p>
     <w:p>
@@ -207,7 +204,7 @@
           <w:sz w:val="28"/>
           <w:szCs w:val="28"/>
         </w:rPr>
-        <w:t>Baustein 4 – Probiotika begleitend zur Eradikationstherapie</w:t>
+        <w:t>Cave: Probiotika nicht zeitgleich mit dem Antibiotikum einnehmen – mindestens 2 Stunden Abstand einhalten.</w:t>
       </w:r>
     </w:p>
     <w:p>
@@ -221,7 +218,7 @@
           <w:sz w:val="22"/>
           <w:szCs w:val="22"/>
         </w:rPr>
-        <w:t xml:space="preserve">Begleitend zur Eradikationstherapie empfehlen wir den Einsatz von Probiotika – insbesondere bei Risikopatienten, z. B. nach vorherigem Therapieabbruch, bekannter Unverträglichkeit oder Rezidiv.</w:t>
+        <w:t>─────────────────────────────────────────</w:t>
       </w:r>
     </w:p>
     <w:p>
@@ -232,10 +229,12 @@
       <w:r>
         <w:rPr>
           <w:rFonts w:ascii="Calibri" w:cs="Calibri" w:eastAsia="Calibri" w:hAnsi="Calibri"/>
+          <w:b/>
+          <w:i w:val="0"/>
           <w:sz w:val="22"/>
           <w:szCs w:val="22"/>
         </w:rPr>
-        <w:t xml:space="preserve">Probiotika können die Eradikationsrate verbessern und gastrointestinale Nebenwirkungen der Antibiotikatherapie (Diarrhö, Übelkeit, Erbrechen) deutlich reduzieren. Gut geeignet sind Präparate auf Basis von Bifidobacterium longum, Lactobacillus-Spezies oder Saccharomyces boulardii. Einnahme für die Dauer der Therapie, idealerweise bereits einige Tage vorher beginnen.</w:t>
+        <w:t>Baustein 4 – Haushaltsmitglieder</w:t>
       </w:r>
     </w:p>
     <w:p>
@@ -245,13 +244,16 @@
       <w:r>
         <w:rPr>
           <w:rFonts w:ascii="Calibri" w:cs="Calibri" w:eastAsia="Calibri" w:hAnsi="Calibri"/>
-          <w:i/>
+          <w:i w:val="0"/>
           <w:iCs/>
           <w:color w:val="6B7F80"/>
           <w:sz w:val="19"/>
           <w:szCs w:val="19"/>
         </w:rPr>
-        <w:t xml:space="preserve">Cave: Probiotika nicht zeitgleich mit dem Antibiotikum einnehmen – mindestens 2 Stunden Abstand einhalten.</w:t>
+        <w:t>Wir weisen darauf hin, dass H. pylori intrafamiliär übertragen werden kann. Ein routinemäßiges Screening asymptomatischer Haushaltsmitglieder ist leitliniengemäß nicht generell empfohlen. Eine Testung empfehlen wir bei Dyspepsie-Symptomatik, Herkunft aus einem Hochprävalenzland oder auf ausdrücklichen Patientenwunsch.</w:t>
+        <w:br/>
+        <w:br/>
+        <w:t>Im Rahmen der Magenkrebs-Prävention empfehlen wir darüber hinaus eine gezielte Familienanamnese hinsichtlich gastraler Malignome. Bei entsprechender Familienanamnese (Magenkarzinom bei Erstgradigverwandten) befürworten wir ein Test-and-Treat-Vorgehen für H. pylori — auch bei asymptomatischen Angehörigen — als niedrigschwellige und evidenzbasierte Präventionsmaßnahme.</w:t>
       </w:r>
     </w:p>
     <w:p>

</xml_diff>

<commit_message>
B2: Eradikationskontrolle um Stuhl-Antigen ergänzt; B3: Probiotika als Kann-Empfehlung
</commit_message>
<xml_diff>
--- a/HP_Arztbrief_Textbausteine.docx
+++ b/HP_Arztbrief_Textbausteine.docx
@@ -132,7 +132,7 @@
           <w:sz w:val="22"/>
           <w:szCs w:val="22"/>
         </w:rPr>
-        <w:t xml:space="preserve">Eradikationskontrolle: ¹³C-Harnstoff-Atemtest frühestens 4 Wochen nach Therapieende; PPI-Pause mindestens 2 Wochen vor dem Test.</w:t>
+        <w:t>Eradikationskontrolle: Wir empfehlen eine Kontrolle frühestens 4 Wochen nach Therapieende, bevorzugt mittels ¹³C-Harnstoff-Atemtest oder H.-pylori-Stuhl-Antigen (beide gleichwertig valide). PPI-Pause mindestens 2 Wochen, Antibiotika-Pause mindestens 4 Wochen vor dem Test.</w:t>
       </w:r>
     </w:p>
     <w:p>
@@ -175,7 +175,7 @@
           <w:sz w:val="22"/>
           <w:szCs w:val="22"/>
         </w:rPr>
-        <w:t>Begleitend zur Eradikationstherapie empfehlen wir den Einsatz von Probiotika – insbesondere bei Risikopatienten, z. B. nach vorherigem Therapieabbruch, bekannter Unverträglichkeit oder Rezidiv.</w:t>
+        <w:t>Bei Risikopatienten — z. B. nach vorherigem Therapieabbruch, bekannter Unverträglichkeit oder gastrointestinaler Beschwerden unter Antibiotika — kann der begleitende Einsatz von Probiotika erwogen werden.</w:t>
       </w:r>
     </w:p>
     <w:p>
@@ -188,7 +188,7 @@
           <w:sz w:val="18"/>
           <w:szCs w:val="18"/>
         </w:rPr>
-        <w:t>Probiotika können die Eradikationsrate verbessern und gastrointestinale Nebenwirkungen der Antibiotikatherapie (Diarrhö, Übelkeit, Erbrechen) deutlich reduzieren. Gut geeignet sind Präparate auf Basis von Bifidobacterium longum, Lactobacillus-Spezies oder Saccharomyces boulardii. Einnahme für die Dauer der Therapie, idealerweise bereits einige Tage vorher beginnen.</w:t>
+        <w:t>Probiotika können die Eradikationsrate verbessern und gastrointestinale Nebenwirkungen (Diarrhö, Übelkeit) reduzieren. Geeignete Präparate: Bifidobacterium longum, Lactobacillus-Spezies oder Saccharomyces boulardii — idealerweise bereits einige Tage vor Therapiebeginn starten.</w:t>
       </w:r>
     </w:p>
     <w:p>

</xml_diff>

<commit_message>
B2: Eradikationsversagen + Resistenztestung ergänzt
</commit_message>
<xml_diff>
--- a/HP_Arztbrief_Textbausteine.docx
+++ b/HP_Arztbrief_Textbausteine.docx
@@ -133,6 +133,32 @@
           <w:szCs w:val="22"/>
         </w:rPr>
         <w:t>Eradikationskontrolle: Wir empfehlen eine Kontrolle frühestens 4 Wochen nach Therapieende, bevorzugt mittels ¹³C-Harnstoff-Atemtest oder H.-pylori-Stuhl-Antigen (beide gleichwertig valide). PPI-Pause mindestens 2 Wochen, Antibiotika-Pause mindestens 4 Wochen vor dem Test.</w:t>
+      </w:r>
+    </w:p>
+    <w:p>
+      <w:pPr>
+        <w:spacing w:before="120" w:after="40"/>
+      </w:pPr>
+      <w:r>
+        <w:rPr>
+          <w:b/>
+          <w:i w:val="0"/>
+          <w:sz w:val="22"/>
+        </w:rPr>
+        <w:t>Eradikationsversagen:</w:t>
+      </w:r>
+    </w:p>
+    <w:p>
+      <w:pPr>
+        <w:spacing w:before="0" w:after="160"/>
+      </w:pPr>
+      <w:r>
+        <w:rPr>
+          <w:b w:val="0"/>
+          <w:i w:val="0"/>
+          <w:sz w:val="22"/>
+        </w:rPr>
+        <w:t>Bei Therapieversagen (persistierender Nachweis nach Eradikationskontrolle) empfehlen wir eine Resistenztestung (Kultur und Antibiogramm aus Magenbiopsien) vor Einleitung einer Rescue-Therapie. Eine empirische Zweitlinientherapie ohne Resistenzdiagnostik ist bei steigenden Clarithromycin- und Metronidazol-Resistenzraten nicht empfehlenswert.</w:t>
       </w:r>
     </w:p>
     <w:p>

</xml_diff>